<commit_message>
Finalize submission documents and publish recorded demo
</commit_message>
<xml_diff>
--- a/output/presentation/localmind-demo-and-speaking-guide.docx
+++ b/output/presentation/localmind-demo-and-speaking-guide.docx
@@ -55,9 +55,9 @@
           <w:b w:val="0"/>
           <w:i w:val="0"/>
         </w:rPr>
-        <w:t>SIT  |  Minors in AIML  |  Academic year 23-27</w:t>
+        <w:t>SIT  |  Bachelor of Computer Science Engineering</w:t>
         <w:br/>
-        <w:t>Guide  Dr. Sonali Kothari</w:t>
+        <w:t>Academic year 23-27  |  Guide  Dr. Sonali Kothari</w:t>
       </w:r>
     </w:p>
     <w:p>

</xml_diff>